<commit_message>
Demo rerun with the letters: 129 steps, 0 failed
Every format the Arkaja bid needs as its full letter in Word and PDF
(demo/arkaja-seci-rtc-tm-v/letters/), all letters in one Word file and one
PDF, the in-place edit and revert shown in the report, and the bid saved to
the scenario library. The bidder is fictional.

Co-Authored-By: Claude Opus 5.5 <noreply@anthropic.com>
Claude-Session: https://claude.ai/code/session_016jKkuHBjiyJimAVAdehBdi
</commit_message>
<xml_diff>
--- a/demo/arkaja-seci-rtc-tm-v/bid-pack/SECI_RTC_TM_V_bid_200MW.docx
+++ b/demo/arkaja-seci-rtc-tm-v/bid-pack/SECI_RTC_TM_V_bid_200MW.docx
@@ -2008,7 +2008,7 @@
                 <w:sz w:val="18"/>
                 <w:szCs w:val="18"/>
               </w:rPr>
-              <w:t xml:space="preserve">2025-26</w:t>
+              <w:t xml:space="preserve">2024-25</w:t>
             </w:r>
           </w:p>
         </w:tc>
@@ -6890,6 +6890,63 @@
                 <w:sz w:val="18"/>
                 <w:szCs w:val="18"/>
               </w:rPr>
+              <w:t xml:space="preserve">RfS date</w:t>
+            </w:r>
+          </w:p>
+        </w:tc>
+        <w:tc>
+          <w:tcPr>
+            <w:tcW w:w="5600" w:type="dxa"/>
+          </w:tcPr>
+          <w:p>
+            <w:pPr>
+              <w:spacing w:before="0" w:after="60"/>
+            </w:pPr>
+            <w:r>
+              <w:rPr>
+                <w:sz w:val="18"/>
+                <w:szCs w:val="18"/>
+              </w:rPr>
+              <w:t xml:space="preserve">10.03.2026</w:t>
+            </w:r>
+          </w:p>
+        </w:tc>
+        <w:tc>
+          <w:tcPr>
+            <w:tcW w:w="900" w:type="dxa"/>
+          </w:tcPr>
+          <w:p>
+            <w:pPr>
+              <w:spacing w:before="0" w:after="60"/>
+            </w:pPr>
+            <w:r>
+              <w:rPr>
+                <w:sz w:val="18"/>
+                <w:szCs w:val="18"/>
+              </w:rPr>
+              <w:t xml:space="preserve">74</w:t>
+            </w:r>
+          </w:p>
+        </w:tc>
+      </w:tr>
+      <w:tr>
+        <w:trPr>
+          <w:cantSplit/>
+        </w:trPr>
+        <w:tc>
+          <w:tcPr>
+            <w:tcW w:w="3400" w:type="dxa"/>
+          </w:tcPr>
+          <w:p>
+            <w:pPr>
+              <w:spacing w:before="0" w:after="60"/>
+            </w:pPr>
+            <w:r>
+              <w:rPr>
+                <w:b/>
+                <w:sz w:val="18"/>
+                <w:szCs w:val="18"/>
+              </w:rPr>
               <w:t xml:space="preserve">Bank name and address</w:t>
             </w:r>
           </w:p>
@@ -7175,7 +7232,7 @@
                 <w:sz w:val="18"/>
                 <w:szCs w:val="18"/>
               </w:rPr>
-              <w:t xml:space="preserve">Bank officer name and power of attorney no.</w:t>
+              <w:t xml:space="preserve">Bank officer name and designation</w:t>
             </w:r>
           </w:p>
         </w:tc>
@@ -7192,7 +7249,7 @@
                 <w:sz w:val="18"/>
                 <w:szCs w:val="18"/>
               </w:rPr>
-              <w:t xml:space="preserve">R. Iyer, Chief Manager, Power of Attorney No. DBL/PoA/2219</w:t>
+              <w:t xml:space="preserve">R. Iyer, Chief Manager</w:t>
             </w:r>
           </w:p>
         </w:tc>
@@ -7232,7 +7289,7 @@
                 <w:sz w:val="18"/>
                 <w:szCs w:val="18"/>
               </w:rPr>
-              <w:t xml:space="preserve">Bank contact details and e-mail</w:t>
+              <w:t xml:space="preserve">Bank officer's Power of Attorney No.</w:t>
             </w:r>
           </w:p>
         </w:tc>
@@ -7249,7 +7306,121 @@
                 <w:sz w:val="18"/>
                 <w:szCs w:val="18"/>
               </w:rPr>
-              <w:t xml:space="preserve">cp.branch@demobank.example, +91 11 4000 0000</w:t>
+              <w:t xml:space="preserve">DBL/PoA/2219</w:t>
+            </w:r>
+          </w:p>
+        </w:tc>
+        <w:tc>
+          <w:tcPr>
+            <w:tcW w:w="900" w:type="dxa"/>
+          </w:tcPr>
+          <w:p>
+            <w:pPr>
+              <w:spacing w:before="0" w:after="60"/>
+            </w:pPr>
+            <w:r>
+              <w:rPr>
+                <w:sz w:val="18"/>
+                <w:szCs w:val="18"/>
+              </w:rPr>
+              <w:t xml:space="preserve">75</w:t>
+            </w:r>
+          </w:p>
+        </w:tc>
+      </w:tr>
+      <w:tr>
+        <w:trPr>
+          <w:cantSplit/>
+        </w:trPr>
+        <w:tc>
+          <w:tcPr>
+            <w:tcW w:w="3400" w:type="dxa"/>
+          </w:tcPr>
+          <w:p>
+            <w:pPr>
+              <w:spacing w:before="0" w:after="60"/>
+            </w:pPr>
+            <w:r>
+              <w:rPr>
+                <w:b/>
+                <w:sz w:val="18"/>
+                <w:szCs w:val="18"/>
+              </w:rPr>
+              <w:t xml:space="preserve">Contact details of the bank</w:t>
+            </w:r>
+          </w:p>
+        </w:tc>
+        <w:tc>
+          <w:tcPr>
+            <w:tcW w:w="5600" w:type="dxa"/>
+          </w:tcPr>
+          <w:p>
+            <w:pPr>
+              <w:spacing w:before="0" w:after="60"/>
+            </w:pPr>
+            <w:r>
+              <w:rPr>
+                <w:sz w:val="18"/>
+                <w:szCs w:val="18"/>
+              </w:rPr>
+              <w:t xml:space="preserve">Connaught Place Branch, Block A, Connaught Place, New Delhi 110001; +91 11 4000 0000</w:t>
+            </w:r>
+          </w:p>
+        </w:tc>
+        <w:tc>
+          <w:tcPr>
+            <w:tcW w:w="900" w:type="dxa"/>
+          </w:tcPr>
+          <w:p>
+            <w:pPr>
+              <w:spacing w:before="0" w:after="60"/>
+            </w:pPr>
+            <w:r>
+              <w:rPr>
+                <w:sz w:val="18"/>
+                <w:szCs w:val="18"/>
+              </w:rPr>
+              <w:t xml:space="preserve">75</w:t>
+            </w:r>
+          </w:p>
+        </w:tc>
+      </w:tr>
+      <w:tr>
+        <w:trPr>
+          <w:cantSplit/>
+        </w:trPr>
+        <w:tc>
+          <w:tcPr>
+            <w:tcW w:w="3400" w:type="dxa"/>
+          </w:tcPr>
+          <w:p>
+            <w:pPr>
+              <w:spacing w:before="0" w:after="60"/>
+            </w:pPr>
+            <w:r>
+              <w:rPr>
+                <w:b/>
+                <w:sz w:val="18"/>
+                <w:szCs w:val="18"/>
+              </w:rPr>
+              <w:t xml:space="preserve">E-mail ID of the bank</w:t>
+            </w:r>
+          </w:p>
+        </w:tc>
+        <w:tc>
+          <w:tcPr>
+            <w:tcW w:w="5600" w:type="dxa"/>
+          </w:tcPr>
+          <w:p>
+            <w:pPr>
+              <w:spacing w:before="0" w:after="60"/>
+            </w:pPr>
+            <w:r>
+              <w:rPr>
+                <w:sz w:val="18"/>
+                <w:szCs w:val="18"/>
+              </w:rPr>
+              <w:t xml:space="preserve">cp.branch@demobank.example</w:t>
             </w:r>
           </w:p>
         </w:tc>
@@ -8280,6 +8451,63 @@
                 <w:sz w:val="18"/>
                 <w:szCs w:val="18"/>
               </w:rPr>
+              <w:t xml:space="preserve">Place of payment (from SECI's address)</w:t>
+            </w:r>
+          </w:p>
+        </w:tc>
+        <w:tc>
+          <w:tcPr>
+            <w:tcW w:w="5600" w:type="dxa"/>
+          </w:tcPr>
+          <w:p>
+            <w:pPr>
+              <w:spacing w:before="0" w:after="60"/>
+            </w:pPr>
+            <w:r>
+              <w:rPr>
+                <w:sz w:val="18"/>
+                <w:szCs w:val="18"/>
+              </w:rPr>
+              <w:t xml:space="preserve">Noida</w:t>
+            </w:r>
+          </w:p>
+        </w:tc>
+        <w:tc>
+          <w:tcPr>
+            <w:tcW w:w="900" w:type="dxa"/>
+          </w:tcPr>
+          <w:p>
+            <w:pPr>
+              <w:spacing w:before="0" w:after="60"/>
+            </w:pPr>
+            <w:r>
+              <w:rPr>
+                <w:sz w:val="18"/>
+                <w:szCs w:val="18"/>
+              </w:rPr>
+              <w:t xml:space="preserve">81</w:t>
+            </w:r>
+          </w:p>
+        </w:tc>
+      </w:tr>
+      <w:tr>
+        <w:trPr>
+          <w:cantSplit/>
+        </w:trPr>
+        <w:tc>
+          <w:tcPr>
+            <w:tcW w:w="3400" w:type="dxa"/>
+          </w:tcPr>
+          <w:p>
+            <w:pPr>
+              <w:spacing w:before="0" w:after="60"/>
+            </w:pPr>
+            <w:r>
+              <w:rPr>
+                <w:b/>
+                <w:sz w:val="18"/>
+                <w:szCs w:val="18"/>
+              </w:rPr>
               <w:t xml:space="preserve">Amount (Rs, also in words)</w:t>
             </w:r>
           </w:p>
@@ -8451,7 +8679,7 @@
                 <w:sz w:val="18"/>
                 <w:szCs w:val="18"/>
               </w:rPr>
-              <w:t xml:space="preserve">Bank officer, power of attorney no., contact and e-mail</w:t>
+              <w:t xml:space="preserve">Bank officer name and designation</w:t>
             </w:r>
           </w:p>
         </w:tc>
@@ -8486,6 +8714,234 @@
                 <w:szCs w:val="18"/>
               </w:rPr>
               <w:t xml:space="preserve">82</w:t>
+            </w:r>
+          </w:p>
+        </w:tc>
+      </w:tr>
+      <w:tr>
+        <w:trPr>
+          <w:cantSplit/>
+        </w:trPr>
+        <w:tc>
+          <w:tcPr>
+            <w:tcW w:w="3400" w:type="dxa"/>
+          </w:tcPr>
+          <w:p>
+            <w:pPr>
+              <w:spacing w:before="0" w:after="60"/>
+            </w:pPr>
+            <w:r>
+              <w:rPr>
+                <w:b/>
+                <w:sz w:val="18"/>
+                <w:szCs w:val="18"/>
+              </w:rPr>
+              <w:t xml:space="preserve">Bank officer's Power of Attorney No.</w:t>
+            </w:r>
+          </w:p>
+        </w:tc>
+        <w:tc>
+          <w:tcPr>
+            <w:tcW w:w="5600" w:type="dxa"/>
+          </w:tcPr>
+          <w:p>
+            <w:pPr>
+              <w:spacing w:before="0" w:after="60"/>
+            </w:pPr>
+            <w:r>
+              <w:rPr>
+                <w:sz w:val="18"/>
+                <w:szCs w:val="18"/>
+              </w:rPr>
+              <w:t xml:space="preserve">________________</w:t>
+            </w:r>
+          </w:p>
+        </w:tc>
+        <w:tc>
+          <w:tcPr>
+            <w:tcW w:w="900" w:type="dxa"/>
+          </w:tcPr>
+          <w:p>
+            <w:pPr>
+              <w:spacing w:before="0" w:after="60"/>
+            </w:pPr>
+            <w:r>
+              <w:rPr>
+                <w:sz w:val="18"/>
+                <w:szCs w:val="18"/>
+              </w:rPr>
+              <w:t xml:space="preserve">82</w:t>
+            </w:r>
+          </w:p>
+        </w:tc>
+      </w:tr>
+      <w:tr>
+        <w:trPr>
+          <w:cantSplit/>
+        </w:trPr>
+        <w:tc>
+          <w:tcPr>
+            <w:tcW w:w="3400" w:type="dxa"/>
+          </w:tcPr>
+          <w:p>
+            <w:pPr>
+              <w:spacing w:before="0" w:after="60"/>
+            </w:pPr>
+            <w:r>
+              <w:rPr>
+                <w:b/>
+                <w:sz w:val="18"/>
+                <w:szCs w:val="18"/>
+              </w:rPr>
+              <w:t xml:space="preserve">Contact details of the bank</w:t>
+            </w:r>
+          </w:p>
+        </w:tc>
+        <w:tc>
+          <w:tcPr>
+            <w:tcW w:w="5600" w:type="dxa"/>
+          </w:tcPr>
+          <w:p>
+            <w:pPr>
+              <w:spacing w:before="0" w:after="60"/>
+            </w:pPr>
+            <w:r>
+              <w:rPr>
+                <w:sz w:val="18"/>
+                <w:szCs w:val="18"/>
+              </w:rPr>
+              <w:t xml:space="preserve">________________</w:t>
+            </w:r>
+          </w:p>
+        </w:tc>
+        <w:tc>
+          <w:tcPr>
+            <w:tcW w:w="900" w:type="dxa"/>
+          </w:tcPr>
+          <w:p>
+            <w:pPr>
+              <w:spacing w:before="0" w:after="60"/>
+            </w:pPr>
+            <w:r>
+              <w:rPr>
+                <w:sz w:val="18"/>
+                <w:szCs w:val="18"/>
+              </w:rPr>
+              <w:t xml:space="preserve">83</w:t>
+            </w:r>
+          </w:p>
+        </w:tc>
+      </w:tr>
+      <w:tr>
+        <w:trPr>
+          <w:cantSplit/>
+        </w:trPr>
+        <w:tc>
+          <w:tcPr>
+            <w:tcW w:w="3400" w:type="dxa"/>
+          </w:tcPr>
+          <w:p>
+            <w:pPr>
+              <w:spacing w:before="0" w:after="60"/>
+            </w:pPr>
+            <w:r>
+              <w:rPr>
+                <w:b/>
+                <w:sz w:val="18"/>
+                <w:szCs w:val="18"/>
+              </w:rPr>
+              <w:t xml:space="preserve">E-mail ID of the bank</w:t>
+            </w:r>
+          </w:p>
+        </w:tc>
+        <w:tc>
+          <w:tcPr>
+            <w:tcW w:w="5600" w:type="dxa"/>
+          </w:tcPr>
+          <w:p>
+            <w:pPr>
+              <w:spacing w:before="0" w:after="60"/>
+            </w:pPr>
+            <w:r>
+              <w:rPr>
+                <w:sz w:val="18"/>
+                <w:szCs w:val="18"/>
+              </w:rPr>
+              <w:t xml:space="preserve">________________</w:t>
+            </w:r>
+          </w:p>
+        </w:tc>
+        <w:tc>
+          <w:tcPr>
+            <w:tcW w:w="900" w:type="dxa"/>
+          </w:tcPr>
+          <w:p>
+            <w:pPr>
+              <w:spacing w:before="0" w:after="60"/>
+            </w:pPr>
+            <w:r>
+              <w:rPr>
+                <w:sz w:val="18"/>
+                <w:szCs w:val="18"/>
+              </w:rPr>
+              <w:t xml:space="preserve">83</w:t>
+            </w:r>
+          </w:p>
+        </w:tc>
+      </w:tr>
+      <w:tr>
+        <w:trPr>
+          <w:cantSplit/>
+        </w:trPr>
+        <w:tc>
+          <w:tcPr>
+            <w:tcW w:w="3400" w:type="dxa"/>
+          </w:tcPr>
+          <w:p>
+            <w:pPr>
+              <w:spacing w:before="0" w:after="60"/>
+            </w:pPr>
+            <w:r>
+              <w:rPr>
+                <w:b/>
+                <w:sz w:val="18"/>
+                <w:szCs w:val="18"/>
+              </w:rPr>
+              <w:t xml:space="preserve">Date of the guarantee</w:t>
+            </w:r>
+          </w:p>
+        </w:tc>
+        <w:tc>
+          <w:tcPr>
+            <w:tcW w:w="5600" w:type="dxa"/>
+          </w:tcPr>
+          <w:p>
+            <w:pPr>
+              <w:spacing w:before="0" w:after="60"/>
+            </w:pPr>
+            <w:r>
+              <w:rPr>
+                <w:sz w:val="18"/>
+                <w:szCs w:val="18"/>
+              </w:rPr>
+              <w:t xml:space="preserve">________________</w:t>
+            </w:r>
+          </w:p>
+        </w:tc>
+        <w:tc>
+          <w:tcPr>
+            <w:tcW w:w="900" w:type="dxa"/>
+          </w:tcPr>
+          <w:p>
+            <w:pPr>
+              <w:spacing w:before="0" w:after="60"/>
+            </w:pPr>
+            <w:r>
+              <w:rPr>
+                <w:sz w:val="18"/>
+                <w:szCs w:val="18"/>
+              </w:rPr>
+              <w:t xml:space="preserve">83</w:t>
             </w:r>
           </w:p>
         </w:tc>
@@ -9385,6 +9841,63 @@
                 <w:sz w:val="18"/>
                 <w:szCs w:val="18"/>
               </w:rPr>
+              <w:t xml:space="preserve">Project location(s)</w:t>
+            </w:r>
+          </w:p>
+        </w:tc>
+        <w:tc>
+          <w:tcPr>
+            <w:tcW w:w="5600" w:type="dxa"/>
+          </w:tcPr>
+          <w:p>
+            <w:pPr>
+              <w:spacing w:before="0" w:after="60"/>
+            </w:pPr>
+            <w:r>
+              <w:rPr>
+                <w:sz w:val="18"/>
+                <w:szCs w:val="18"/>
+              </w:rPr>
+              <w:t xml:space="preserve">Pokaran, Jaisalmer, Rajasthan</w:t>
+            </w:r>
+          </w:p>
+        </w:tc>
+        <w:tc>
+          <w:tcPr>
+            <w:tcW w:w="900" w:type="dxa"/>
+          </w:tcPr>
+          <w:p>
+            <w:pPr>
+              <w:spacing w:before="0" w:after="60"/>
+            </w:pPr>
+            <w:r>
+              <w:rPr>
+                <w:sz w:val="18"/>
+                <w:szCs w:val="18"/>
+              </w:rPr>
+              <w:t xml:space="preserve">84</w:t>
+            </w:r>
+          </w:p>
+        </w:tc>
+      </w:tr>
+      <w:tr>
+        <w:trPr>
+          <w:cantSplit/>
+        </w:trPr>
+        <w:tc>
+          <w:tcPr>
+            <w:tcW w:w="3400" w:type="dxa"/>
+          </w:tcPr>
+          <w:p>
+            <w:pPr>
+              <w:spacing w:before="0" w:after="60"/>
+            </w:pPr>
+            <w:r>
+              <w:rPr>
+                <w:b/>
+                <w:sz w:val="18"/>
+                <w:szCs w:val="18"/>
+              </w:rPr>
               <w:t xml:space="preserve">RfS name</w:t>
             </w:r>
           </w:p>
@@ -9499,6 +10012,63 @@
                 <w:sz w:val="18"/>
                 <w:szCs w:val="18"/>
               </w:rPr>
+              <w:t xml:space="preserve">RfS date</w:t>
+            </w:r>
+          </w:p>
+        </w:tc>
+        <w:tc>
+          <w:tcPr>
+            <w:tcW w:w="5600" w:type="dxa"/>
+          </w:tcPr>
+          <w:p>
+            <w:pPr>
+              <w:spacing w:before="0" w:after="60"/>
+            </w:pPr>
+            <w:r>
+              <w:rPr>
+                <w:sz w:val="18"/>
+                <w:szCs w:val="18"/>
+              </w:rPr>
+              <w:t xml:space="preserve">10.03.2026</w:t>
+            </w:r>
+          </w:p>
+        </w:tc>
+        <w:tc>
+          <w:tcPr>
+            <w:tcW w:w="900" w:type="dxa"/>
+          </w:tcPr>
+          <w:p>
+            <w:pPr>
+              <w:spacing w:before="0" w:after="60"/>
+            </w:pPr>
+            <w:r>
+              <w:rPr>
+                <w:sz w:val="18"/>
+                <w:szCs w:val="18"/>
+              </w:rPr>
+              <w:t xml:space="preserve">84</w:t>
+            </w:r>
+          </w:p>
+        </w:tc>
+      </w:tr>
+      <w:tr>
+        <w:trPr>
+          <w:cantSplit/>
+        </w:trPr>
+        <w:tc>
+          <w:tcPr>
+            <w:tcW w:w="3400" w:type="dxa"/>
+          </w:tcPr>
+          <w:p>
+            <w:pPr>
+              <w:spacing w:before="0" w:after="60"/>
+            </w:pPr>
+            <w:r>
+              <w:rPr>
+                <w:b/>
+                <w:sz w:val="18"/>
+                <w:szCs w:val="18"/>
+              </w:rPr>
               <w:t xml:space="preserve">REC/PFC name, address, registered office</w:t>
             </w:r>
           </w:p>
@@ -9517,6 +10087,63 @@
                 <w:szCs w:val="18"/>
               </w:rPr>
               <w:t xml:space="preserve">________________</w:t>
+            </w:r>
+          </w:p>
+        </w:tc>
+        <w:tc>
+          <w:tcPr>
+            <w:tcW w:w="900" w:type="dxa"/>
+          </w:tcPr>
+          <w:p>
+            <w:pPr>
+              <w:spacing w:before="0" w:after="60"/>
+            </w:pPr>
+            <w:r>
+              <w:rPr>
+                <w:sz w:val="18"/>
+                <w:szCs w:val="18"/>
+              </w:rPr>
+              <w:t xml:space="preserve">84</w:t>
+            </w:r>
+          </w:p>
+        </w:tc>
+      </w:tr>
+      <w:tr>
+        <w:trPr>
+          <w:cantSplit/>
+        </w:trPr>
+        <w:tc>
+          <w:tcPr>
+            <w:tcW w:w="3400" w:type="dxa"/>
+          </w:tcPr>
+          <w:p>
+            <w:pPr>
+              <w:spacing w:before="0" w:after="60"/>
+            </w:pPr>
+            <w:r>
+              <w:rPr>
+                <w:b/>
+                <w:sz w:val="18"/>
+                <w:szCs w:val="18"/>
+              </w:rPr>
+              <w:t xml:space="preserve">Place of payment (from SECI's address)</w:t>
+            </w:r>
+          </w:p>
+        </w:tc>
+        <w:tc>
+          <w:tcPr>
+            <w:tcW w:w="5600" w:type="dxa"/>
+          </w:tcPr>
+          <w:p>
+            <w:pPr>
+              <w:spacing w:before="0" w:after="60"/>
+            </w:pPr>
+            <w:r>
+              <w:rPr>
+                <w:sz w:val="18"/>
+                <w:szCs w:val="18"/>
+              </w:rPr>
+              <w:t xml:space="preserve">Noida</w:t>
             </w:r>
           </w:p>
         </w:tc>
@@ -10319,6 +10946,63 @@
                 <w:sz w:val="18"/>
                 <w:szCs w:val="18"/>
               </w:rPr>
+              <w:t xml:space="preserve">RfS date</w:t>
+            </w:r>
+          </w:p>
+        </w:tc>
+        <w:tc>
+          <w:tcPr>
+            <w:tcW w:w="5600" w:type="dxa"/>
+          </w:tcPr>
+          <w:p>
+            <w:pPr>
+              <w:spacing w:before="0" w:after="60"/>
+            </w:pPr>
+            <w:r>
+              <w:rPr>
+                <w:sz w:val="18"/>
+                <w:szCs w:val="18"/>
+              </w:rPr>
+              <w:t xml:space="preserve">10.03.2026</w:t>
+            </w:r>
+          </w:p>
+        </w:tc>
+        <w:tc>
+          <w:tcPr>
+            <w:tcW w:w="900" w:type="dxa"/>
+          </w:tcPr>
+          <w:p>
+            <w:pPr>
+              <w:spacing w:before="0" w:after="60"/>
+            </w:pPr>
+            <w:r>
+              <w:rPr>
+                <w:sz w:val="18"/>
+                <w:szCs w:val="18"/>
+              </w:rPr>
+              <w:t xml:space="preserve">87</w:t>
+            </w:r>
+          </w:p>
+        </w:tc>
+      </w:tr>
+      <w:tr>
+        <w:trPr>
+          <w:cantSplit/>
+        </w:trPr>
+        <w:tc>
+          <w:tcPr>
+            <w:tcW w:w="3400" w:type="dxa"/>
+          </w:tcPr>
+          <w:p>
+            <w:pPr>
+              <w:spacing w:before="0" w:after="60"/>
+            </w:pPr>
+            <w:r>
+              <w:rPr>
+                <w:b/>
+                <w:sz w:val="18"/>
+                <w:szCs w:val="18"/>
+              </w:rPr>
               <w:t xml:space="preserve">LoA number and date</w:t>
             </w:r>
           </w:p>
@@ -12294,7 +12978,7 @@
                 <w:sz w:val="18"/>
                 <w:szCs w:val="18"/>
               </w:rPr>
-              <w:t xml:space="preserve">Bidding Company / Lead Member name and address</w:t>
+              <w:t xml:space="preserve">Letter date</w:t>
             </w:r>
           </w:p>
         </w:tc>
@@ -12311,6 +12995,63 @@
                 <w:sz w:val="18"/>
                 <w:szCs w:val="18"/>
               </w:rPr>
+              <w:t xml:space="preserve">20.05.2026</w:t>
+            </w:r>
+          </w:p>
+        </w:tc>
+        <w:tc>
+          <w:tcPr>
+            <w:tcW w:w="900" w:type="dxa"/>
+          </w:tcPr>
+          <w:p>
+            <w:pPr>
+              <w:spacing w:before="0" w:after="60"/>
+            </w:pPr>
+            <w:r>
+              <w:rPr>
+                <w:sz w:val="18"/>
+                <w:szCs w:val="18"/>
+              </w:rPr>
+              <w:t xml:space="preserve">96</w:t>
+            </w:r>
+          </w:p>
+        </w:tc>
+      </w:tr>
+      <w:tr>
+        <w:trPr>
+          <w:cantSplit/>
+        </w:trPr>
+        <w:tc>
+          <w:tcPr>
+            <w:tcW w:w="3400" w:type="dxa"/>
+          </w:tcPr>
+          <w:p>
+            <w:pPr>
+              <w:spacing w:before="0" w:after="60"/>
+            </w:pPr>
+            <w:r>
+              <w:rPr>
+                <w:b/>
+                <w:sz w:val="18"/>
+                <w:szCs w:val="18"/>
+              </w:rPr>
+              <w:t xml:space="preserve">Bidding Company / Lead Member name</w:t>
+            </w:r>
+          </w:p>
+        </w:tc>
+        <w:tc>
+          <w:tcPr>
+            <w:tcW w:w="5600" w:type="dxa"/>
+          </w:tcPr>
+          <w:p>
+            <w:pPr>
+              <w:spacing w:before="0" w:after="60"/>
+            </w:pPr>
+            <w:r>
+              <w:rPr>
+                <w:sz w:val="18"/>
+                <w:szCs w:val="18"/>
+              </w:rPr>
               <w:t xml:space="preserve">Arkaja Renewables Private Limited</w:t>
             </w:r>
           </w:p>
@@ -12351,7 +13092,7 @@
                 <w:sz w:val="18"/>
                 <w:szCs w:val="18"/>
               </w:rPr>
-              <w:t xml:space="preserve">Telephone and e-mail</w:t>
+              <w:t xml:space="preserve">Bidder address</w:t>
             </w:r>
           </w:p>
         </w:tc>
@@ -12368,6 +13109,63 @@
                 <w:sz w:val="18"/>
                 <w:szCs w:val="18"/>
               </w:rPr>
+              <w:t xml:space="preserve">Unit 804, Tower B, Sector 62, Noida, Uttar Pradesh 201301</w:t>
+            </w:r>
+          </w:p>
+        </w:tc>
+        <w:tc>
+          <w:tcPr>
+            <w:tcW w:w="900" w:type="dxa"/>
+          </w:tcPr>
+          <w:p>
+            <w:pPr>
+              <w:spacing w:before="0" w:after="60"/>
+            </w:pPr>
+            <w:r>
+              <w:rPr>
+                <w:sz w:val="18"/>
+                <w:szCs w:val="18"/>
+              </w:rPr>
+              <w:t xml:space="preserve">96</w:t>
+            </w:r>
+          </w:p>
+        </w:tc>
+      </w:tr>
+      <w:tr>
+        <w:trPr>
+          <w:cantSplit/>
+        </w:trPr>
+        <w:tc>
+          <w:tcPr>
+            <w:tcW w:w="3400" w:type="dxa"/>
+          </w:tcPr>
+          <w:p>
+            <w:pPr>
+              <w:spacing w:before="0" w:after="60"/>
+            </w:pPr>
+            <w:r>
+              <w:rPr>
+                <w:b/>
+                <w:sz w:val="18"/>
+                <w:szCs w:val="18"/>
+              </w:rPr>
+              <w:t xml:space="preserve">Telephone</w:t>
+            </w:r>
+          </w:p>
+        </w:tc>
+        <w:tc>
+          <w:tcPr>
+            <w:tcW w:w="5600" w:type="dxa"/>
+          </w:tcPr>
+          <w:p>
+            <w:pPr>
+              <w:spacing w:before="0" w:after="60"/>
+            </w:pPr>
+            <w:r>
+              <w:rPr>
+                <w:sz w:val="18"/>
+                <w:szCs w:val="18"/>
+              </w:rPr>
               <w:t xml:space="preserve">+91 120 400 0000</w:t>
             </w:r>
           </w:p>
@@ -12408,6 +13206,63 @@
                 <w:sz w:val="18"/>
                 <w:szCs w:val="18"/>
               </w:rPr>
+              <w:t xml:space="preserve">E-mail</w:t>
+            </w:r>
+          </w:p>
+        </w:tc>
+        <w:tc>
+          <w:tcPr>
+            <w:tcW w:w="5600" w:type="dxa"/>
+          </w:tcPr>
+          <w:p>
+            <w:pPr>
+              <w:spacing w:before="0" w:after="60"/>
+            </w:pPr>
+            <w:r>
+              <w:rPr>
+                <w:sz w:val="18"/>
+                <w:szCs w:val="18"/>
+              </w:rPr>
+              <w:t xml:space="preserve">bids@arkaja-renewables.example</w:t>
+            </w:r>
+          </w:p>
+        </w:tc>
+        <w:tc>
+          <w:tcPr>
+            <w:tcW w:w="900" w:type="dxa"/>
+          </w:tcPr>
+          <w:p>
+            <w:pPr>
+              <w:spacing w:before="0" w:after="60"/>
+            </w:pPr>
+            <w:r>
+              <w:rPr>
+                <w:sz w:val="18"/>
+                <w:szCs w:val="18"/>
+              </w:rPr>
+              <w:t xml:space="preserve">96</w:t>
+            </w:r>
+          </w:p>
+        </w:tc>
+      </w:tr>
+      <w:tr>
+        <w:trPr>
+          <w:cantSplit/>
+        </w:trPr>
+        <w:tc>
+          <w:tcPr>
+            <w:tcW w:w="3400" w:type="dxa"/>
+          </w:tcPr>
+          <w:p>
+            <w:pPr>
+              <w:spacing w:before="0" w:after="60"/>
+            </w:pPr>
+            <w:r>
+              <w:rPr>
+                <w:b/>
+                <w:sz w:val="18"/>
+                <w:szCs w:val="18"/>
+              </w:rPr>
               <w:t xml:space="preserve">RfS number, date and title</w:t>
             </w:r>
           </w:p>
@@ -12465,6 +13320,120 @@
                 <w:sz w:val="18"/>
                 <w:szCs w:val="18"/>
               </w:rPr>
+              <w:t xml:space="preserve">RfS date</w:t>
+            </w:r>
+          </w:p>
+        </w:tc>
+        <w:tc>
+          <w:tcPr>
+            <w:tcW w:w="5600" w:type="dxa"/>
+          </w:tcPr>
+          <w:p>
+            <w:pPr>
+              <w:spacing w:before="0" w:after="60"/>
+            </w:pPr>
+            <w:r>
+              <w:rPr>
+                <w:sz w:val="18"/>
+                <w:szCs w:val="18"/>
+              </w:rPr>
+              <w:t xml:space="preserve">10.03.2026</w:t>
+            </w:r>
+          </w:p>
+        </w:tc>
+        <w:tc>
+          <w:tcPr>
+            <w:tcW w:w="900" w:type="dxa"/>
+          </w:tcPr>
+          <w:p>
+            <w:pPr>
+              <w:spacing w:before="0" w:after="60"/>
+            </w:pPr>
+            <w:r>
+              <w:rPr>
+                <w:sz w:val="18"/>
+                <w:szCs w:val="18"/>
+              </w:rPr>
+              <w:t xml:space="preserve">96</w:t>
+            </w:r>
+          </w:p>
+        </w:tc>
+      </w:tr>
+      <w:tr>
+        <w:trPr>
+          <w:cantSplit/>
+        </w:trPr>
+        <w:tc>
+          <w:tcPr>
+            <w:tcW w:w="3400" w:type="dxa"/>
+          </w:tcPr>
+          <w:p>
+            <w:pPr>
+              <w:spacing w:before="0" w:after="60"/>
+            </w:pPr>
+            <w:r>
+              <w:rPr>
+                <w:b/>
+                <w:sz w:val="18"/>
+                <w:szCs w:val="18"/>
+              </w:rPr>
+              <w:t xml:space="preserve">RfS title</w:t>
+            </w:r>
+          </w:p>
+        </w:tc>
+        <w:tc>
+          <w:tcPr>
+            <w:tcW w:w="5600" w:type="dxa"/>
+          </w:tcPr>
+          <w:p>
+            <w:pPr>
+              <w:spacing w:before="0" w:after="60"/>
+            </w:pPr>
+            <w:r>
+              <w:rPr>
+                <w:sz w:val="18"/>
+                <w:szCs w:val="18"/>
+              </w:rPr>
+              <w:t xml:space="preserve">Supply of 1000 MW Round-the-Clock Thermal Mimic (RTC-TM) power from ISTS-connected RE projects</w:t>
+            </w:r>
+          </w:p>
+        </w:tc>
+        <w:tc>
+          <w:tcPr>
+            <w:tcW w:w="900" w:type="dxa"/>
+          </w:tcPr>
+          <w:p>
+            <w:pPr>
+              <w:spacing w:before="0" w:after="60"/>
+            </w:pPr>
+            <w:r>
+              <w:rPr>
+                <w:sz w:val="18"/>
+                <w:szCs w:val="18"/>
+              </w:rPr>
+              <w:t xml:space="preserve">96</w:t>
+            </w:r>
+          </w:p>
+        </w:tc>
+      </w:tr>
+      <w:tr>
+        <w:trPr>
+          <w:cantSplit/>
+        </w:trPr>
+        <w:tc>
+          <w:tcPr>
+            <w:tcW w:w="3400" w:type="dxa"/>
+          </w:tcPr>
+          <w:p>
+            <w:pPr>
+              <w:spacing w:before="0" w:after="60"/>
+            </w:pPr>
+            <w:r>
+              <w:rPr>
+                <w:b/>
+                <w:sz w:val="18"/>
+                <w:szCs w:val="18"/>
+              </w:rPr>
               <w:t xml:space="preserve">Relying on affiliates?</w:t>
             </w:r>
           </w:p>
@@ -12596,7 +13565,7 @@
                 <w:sz w:val="18"/>
                 <w:szCs w:val="18"/>
               </w:rPr>
-              <w:t xml:space="preserve">2025-26</w:t>
+              <w:t xml:space="preserve">2024-25</w:t>
             </w:r>
           </w:p>
         </w:tc>
@@ -12653,7 +13622,7 @@
                 <w:sz w:val="18"/>
                 <w:szCs w:val="18"/>
               </w:rPr>
-              <w:t xml:space="preserve">Arkaja Renewables Private Limited | Bidding Company | FY 2025-26 | Net worth Rs 6,500 crore</w:t>
+              <w:t xml:space="preserve">Arkaja Renewables Private Limited | Bidding Company | FY 2024-25 | Net worth Rs 6,500 crore</w:t>
             </w:r>
           </w:p>
         </w:tc>
@@ -12824,7 +13793,7 @@
                 <w:sz w:val="18"/>
                 <w:szCs w:val="18"/>
               </w:rPr>
-              <w:t xml:space="preserve">Arkaja Renewables Private Limited | FY 2025-26 | Rs 1,850 crore</w:t>
+              <w:t xml:space="preserve">Arkaja Renewables Private Limited | FY 2024-25 | Rs 1,850 crore</w:t>
             </w:r>
           </w:p>
         </w:tc>
@@ -12938,7 +13907,7 @@
                 <w:sz w:val="18"/>
                 <w:szCs w:val="18"/>
               </w:rPr>
-              <w:t xml:space="preserve">Arkaja Renewables Private Limited | FY 2025-26 | Rs 920 crore</w:t>
+              <w:t xml:space="preserve">Arkaja Renewables Private Limited | FY 2024-25 | Rs 920 crore</w:t>
             </w:r>
           </w:p>
         </w:tc>
@@ -12978,7 +13947,7 @@
                 <w:sz w:val="18"/>
                 <w:szCs w:val="18"/>
               </w:rPr>
-              <w:t xml:space="preserve">CA signature, stamp, membership no., firm regn. no., UDIN, date</w:t>
+              <w:t xml:space="preserve">Chartered Accountant (name, designation, firm)</w:t>
             </w:r>
           </w:p>
         </w:tc>
@@ -12995,7 +13964,292 @@
                 <w:sz w:val="18"/>
                 <w:szCs w:val="18"/>
               </w:rPr>
-              <w:t xml:space="preserve">CA Kavita Menon, Partner, Menon &amp; Associates, M. No. 123456, FRN 012345N, UDIN 26123456DEMO1234, 18.05.2026</w:t>
+              <w:t xml:space="preserve">CA Kavita Menon, Partner, Menon &amp; Associates, Chartered Accountants</w:t>
+            </w:r>
+          </w:p>
+        </w:tc>
+        <w:tc>
+          <w:tcPr>
+            <w:tcW w:w="900" w:type="dxa"/>
+          </w:tcPr>
+          <w:p>
+            <w:pPr>
+              <w:spacing w:before="0" w:after="60"/>
+            </w:pPr>
+            <w:r>
+              <w:rPr>
+                <w:sz w:val="18"/>
+                <w:szCs w:val="18"/>
+              </w:rPr>
+              <w:t xml:space="preserve">99</w:t>
+            </w:r>
+          </w:p>
+        </w:tc>
+      </w:tr>
+      <w:tr>
+        <w:trPr>
+          <w:cantSplit/>
+        </w:trPr>
+        <w:tc>
+          <w:tcPr>
+            <w:tcW w:w="3400" w:type="dxa"/>
+          </w:tcPr>
+          <w:p>
+            <w:pPr>
+              <w:spacing w:before="0" w:after="60"/>
+            </w:pPr>
+            <w:r>
+              <w:rPr>
+                <w:b/>
+                <w:sz w:val="18"/>
+                <w:szCs w:val="18"/>
+              </w:rPr>
+              <w:t xml:space="preserve">Authorised signatory</w:t>
+            </w:r>
+          </w:p>
+        </w:tc>
+        <w:tc>
+          <w:tcPr>
+            <w:tcW w:w="5600" w:type="dxa"/>
+          </w:tcPr>
+          <w:p>
+            <w:pPr>
+              <w:spacing w:before="0" w:after="60"/>
+            </w:pPr>
+            <w:r>
+              <w:rPr>
+                <w:sz w:val="18"/>
+                <w:szCs w:val="18"/>
+              </w:rPr>
+              <w:t xml:space="preserve">Meera Raghavan, Director (Business Development)</w:t>
+            </w:r>
+          </w:p>
+        </w:tc>
+        <w:tc>
+          <w:tcPr>
+            <w:tcW w:w="900" w:type="dxa"/>
+          </w:tcPr>
+          <w:p>
+            <w:pPr>
+              <w:spacing w:before="0" w:after="60"/>
+            </w:pPr>
+            <w:r>
+              <w:rPr>
+                <w:sz w:val="18"/>
+                <w:szCs w:val="18"/>
+              </w:rPr>
+              <w:t xml:space="preserve">99</w:t>
+            </w:r>
+          </w:p>
+        </w:tc>
+      </w:tr>
+      <w:tr>
+        <w:trPr>
+          <w:cantSplit/>
+        </w:trPr>
+        <w:tc>
+          <w:tcPr>
+            <w:tcW w:w="3400" w:type="dxa"/>
+          </w:tcPr>
+          <w:p>
+            <w:pPr>
+              <w:spacing w:before="0" w:after="60"/>
+            </w:pPr>
+            <w:r>
+              <w:rPr>
+                <w:b/>
+                <w:sz w:val="18"/>
+                <w:szCs w:val="18"/>
+              </w:rPr>
+              <w:t xml:space="preserve">CA membership no.</w:t>
+            </w:r>
+          </w:p>
+        </w:tc>
+        <w:tc>
+          <w:tcPr>
+            <w:tcW w:w="5600" w:type="dxa"/>
+          </w:tcPr>
+          <w:p>
+            <w:pPr>
+              <w:spacing w:before="0" w:after="60"/>
+            </w:pPr>
+            <w:r>
+              <w:rPr>
+                <w:sz w:val="18"/>
+                <w:szCs w:val="18"/>
+              </w:rPr>
+              <w:t xml:space="preserve">123456</w:t>
+            </w:r>
+          </w:p>
+        </w:tc>
+        <w:tc>
+          <w:tcPr>
+            <w:tcW w:w="900" w:type="dxa"/>
+          </w:tcPr>
+          <w:p>
+            <w:pPr>
+              <w:spacing w:before="0" w:after="60"/>
+            </w:pPr>
+            <w:r>
+              <w:rPr>
+                <w:sz w:val="18"/>
+                <w:szCs w:val="18"/>
+              </w:rPr>
+              <w:t xml:space="preserve">99</w:t>
+            </w:r>
+          </w:p>
+        </w:tc>
+      </w:tr>
+      <w:tr>
+        <w:trPr>
+          <w:cantSplit/>
+        </w:trPr>
+        <w:tc>
+          <w:tcPr>
+            <w:tcW w:w="3400" w:type="dxa"/>
+          </w:tcPr>
+          <w:p>
+            <w:pPr>
+              <w:spacing w:before="0" w:after="60"/>
+            </w:pPr>
+            <w:r>
+              <w:rPr>
+                <w:b/>
+                <w:sz w:val="18"/>
+                <w:szCs w:val="18"/>
+              </w:rPr>
+              <w:t xml:space="preserve">Registration no. of the CA's firm</w:t>
+            </w:r>
+          </w:p>
+        </w:tc>
+        <w:tc>
+          <w:tcPr>
+            <w:tcW w:w="5600" w:type="dxa"/>
+          </w:tcPr>
+          <w:p>
+            <w:pPr>
+              <w:spacing w:before="0" w:after="60"/>
+            </w:pPr>
+            <w:r>
+              <w:rPr>
+                <w:sz w:val="18"/>
+                <w:szCs w:val="18"/>
+              </w:rPr>
+              <w:t xml:space="preserve">012345N</w:t>
+            </w:r>
+          </w:p>
+        </w:tc>
+        <w:tc>
+          <w:tcPr>
+            <w:tcW w:w="900" w:type="dxa"/>
+          </w:tcPr>
+          <w:p>
+            <w:pPr>
+              <w:spacing w:before="0" w:after="60"/>
+            </w:pPr>
+            <w:r>
+              <w:rPr>
+                <w:sz w:val="18"/>
+                <w:szCs w:val="18"/>
+              </w:rPr>
+              <w:t xml:space="preserve">99</w:t>
+            </w:r>
+          </w:p>
+        </w:tc>
+      </w:tr>
+      <w:tr>
+        <w:trPr>
+          <w:cantSplit/>
+        </w:trPr>
+        <w:tc>
+          <w:tcPr>
+            <w:tcW w:w="3400" w:type="dxa"/>
+          </w:tcPr>
+          <w:p>
+            <w:pPr>
+              <w:spacing w:before="0" w:after="60"/>
+            </w:pPr>
+            <w:r>
+              <w:rPr>
+                <w:b/>
+                <w:sz w:val="18"/>
+                <w:szCs w:val="18"/>
+              </w:rPr>
+              <w:t xml:space="preserve">UDIN</w:t>
+            </w:r>
+          </w:p>
+        </w:tc>
+        <w:tc>
+          <w:tcPr>
+            <w:tcW w:w="5600" w:type="dxa"/>
+          </w:tcPr>
+          <w:p>
+            <w:pPr>
+              <w:spacing w:before="0" w:after="60"/>
+            </w:pPr>
+            <w:r>
+              <w:rPr>
+                <w:sz w:val="18"/>
+                <w:szCs w:val="18"/>
+              </w:rPr>
+              <w:t xml:space="preserve">26123456DEMO1234</w:t>
+            </w:r>
+          </w:p>
+        </w:tc>
+        <w:tc>
+          <w:tcPr>
+            <w:tcW w:w="900" w:type="dxa"/>
+          </w:tcPr>
+          <w:p>
+            <w:pPr>
+              <w:spacing w:before="0" w:after="60"/>
+            </w:pPr>
+            <w:r>
+              <w:rPr>
+                <w:sz w:val="18"/>
+                <w:szCs w:val="18"/>
+              </w:rPr>
+              <w:t xml:space="preserve">99</w:t>
+            </w:r>
+          </w:p>
+        </w:tc>
+      </w:tr>
+      <w:tr>
+        <w:trPr>
+          <w:cantSplit/>
+        </w:trPr>
+        <w:tc>
+          <w:tcPr>
+            <w:tcW w:w="3400" w:type="dxa"/>
+          </w:tcPr>
+          <w:p>
+            <w:pPr>
+              <w:spacing w:before="0" w:after="60"/>
+            </w:pPr>
+            <w:r>
+              <w:rPr>
+                <w:b/>
+                <w:sz w:val="18"/>
+                <w:szCs w:val="18"/>
+              </w:rPr>
+              <w:t xml:space="preserve">Date of the CA's certificate</w:t>
+            </w:r>
+          </w:p>
+        </w:tc>
+        <w:tc>
+          <w:tcPr>
+            <w:tcW w:w="5600" w:type="dxa"/>
+          </w:tcPr>
+          <w:p>
+            <w:pPr>
+              <w:spacing w:before="0" w:after="60"/>
+            </w:pPr>
+            <w:r>
+              <w:rPr>
+                <w:sz w:val="18"/>
+                <w:szCs w:val="18"/>
+              </w:rPr>
+              <w:t xml:space="preserve">18.05.2026</w:t>
             </w:r>
           </w:p>
         </w:tc>
@@ -13683,6 +14937,63 @@
                 <w:sz w:val="18"/>
                 <w:szCs w:val="18"/>
               </w:rPr>
+              <w:t xml:space="preserve">RfS date</w:t>
+            </w:r>
+          </w:p>
+        </w:tc>
+        <w:tc>
+          <w:tcPr>
+            <w:tcW w:w="5600" w:type="dxa"/>
+          </w:tcPr>
+          <w:p>
+            <w:pPr>
+              <w:spacing w:before="0" w:after="60"/>
+            </w:pPr>
+            <w:r>
+              <w:rPr>
+                <w:sz w:val="18"/>
+                <w:szCs w:val="18"/>
+              </w:rPr>
+              <w:t xml:space="preserve">10.03.2026</w:t>
+            </w:r>
+          </w:p>
+        </w:tc>
+        <w:tc>
+          <w:tcPr>
+            <w:tcW w:w="900" w:type="dxa"/>
+          </w:tcPr>
+          <w:p>
+            <w:pPr>
+              <w:spacing w:before="0" w:after="60"/>
+            </w:pPr>
+            <w:r>
+              <w:rPr>
+                <w:sz w:val="18"/>
+                <w:szCs w:val="18"/>
+              </w:rPr>
+              <w:t xml:space="preserve">100</w:t>
+            </w:r>
+          </w:p>
+        </w:tc>
+      </w:tr>
+      <w:tr>
+        <w:trPr>
+          <w:cantSplit/>
+        </w:trPr>
+        <w:tc>
+          <w:tcPr>
+            <w:tcW w:w="3400" w:type="dxa"/>
+          </w:tcPr>
+          <w:p>
+            <w:pPr>
+              <w:spacing w:before="0" w:after="60"/>
+            </w:pPr>
+            <w:r>
+              <w:rPr>
+                <w:b/>
+                <w:sz w:val="18"/>
+                <w:szCs w:val="18"/>
+              </w:rPr>
               <w:t xml:space="preserve">Last date of bid submission (twice)</w:t>
             </w:r>
           </w:p>
@@ -14218,7 +15529,7 @@
                 <w:sz w:val="18"/>
                 <w:szCs w:val="18"/>
               </w:rPr>
-              <w:t xml:space="preserve">Reference number and date</w:t>
+              <w:t xml:space="preserve">Reference number</w:t>
             </w:r>
           </w:p>
         </w:tc>
@@ -14235,6 +15546,63 @@
                 <w:sz w:val="18"/>
                 <w:szCs w:val="18"/>
               </w:rPr>
+              <w:t xml:space="preserve">ARK/SECI/RTC-TM-V/2026/003</w:t>
+            </w:r>
+          </w:p>
+        </w:tc>
+        <w:tc>
+          <w:tcPr>
+            <w:tcW w:w="900" w:type="dxa"/>
+          </w:tcPr>
+          <w:p>
+            <w:pPr>
+              <w:spacing w:before="0" w:after="60"/>
+            </w:pPr>
+            <w:r>
+              <w:rPr>
+                <w:sz w:val="18"/>
+                <w:szCs w:val="18"/>
+              </w:rPr>
+              <w:t xml:space="preserve">101</w:t>
+            </w:r>
+          </w:p>
+        </w:tc>
+      </w:tr>
+      <w:tr>
+        <w:trPr>
+          <w:cantSplit/>
+        </w:trPr>
+        <w:tc>
+          <w:tcPr>
+            <w:tcW w:w="3400" w:type="dxa"/>
+          </w:tcPr>
+          <w:p>
+            <w:pPr>
+              <w:spacing w:before="0" w:after="60"/>
+            </w:pPr>
+            <w:r>
+              <w:rPr>
+                <w:b/>
+                <w:sz w:val="18"/>
+                <w:szCs w:val="18"/>
+              </w:rPr>
+              <w:t xml:space="preserve">Letter date</w:t>
+            </w:r>
+          </w:p>
+        </w:tc>
+        <w:tc>
+          <w:tcPr>
+            <w:tcW w:w="5600" w:type="dxa"/>
+          </w:tcPr>
+          <w:p>
+            <w:pPr>
+              <w:spacing w:before="0" w:after="60"/>
+            </w:pPr>
+            <w:r>
+              <w:rPr>
+                <w:sz w:val="18"/>
+                <w:szCs w:val="18"/>
+              </w:rPr>
               <w:t xml:space="preserve">20.05.2026</w:t>
             </w:r>
           </w:p>
@@ -14275,7 +15643,7 @@
                 <w:sz w:val="18"/>
                 <w:szCs w:val="18"/>
               </w:rPr>
-              <w:t xml:space="preserve">Bidding Company / Lead Member name and address</w:t>
+              <w:t xml:space="preserve">Bidding Company / Lead Member name</w:t>
             </w:r>
           </w:p>
         </w:tc>
@@ -14332,7 +15700,7 @@
                 <w:sz w:val="18"/>
                 <w:szCs w:val="18"/>
               </w:rPr>
-              <w:t xml:space="preserve">Telephone and e-mail</w:t>
+              <w:t xml:space="preserve">Bidder address</w:t>
             </w:r>
           </w:p>
         </w:tc>
@@ -14349,6 +15717,63 @@
                 <w:sz w:val="18"/>
                 <w:szCs w:val="18"/>
               </w:rPr>
+              <w:t xml:space="preserve">Unit 804, Tower B, Sector 62, Noida, Uttar Pradesh 201301</w:t>
+            </w:r>
+          </w:p>
+        </w:tc>
+        <w:tc>
+          <w:tcPr>
+            <w:tcW w:w="900" w:type="dxa"/>
+          </w:tcPr>
+          <w:p>
+            <w:pPr>
+              <w:spacing w:before="0" w:after="60"/>
+            </w:pPr>
+            <w:r>
+              <w:rPr>
+                <w:sz w:val="18"/>
+                <w:szCs w:val="18"/>
+              </w:rPr>
+              <w:t xml:space="preserve">101</w:t>
+            </w:r>
+          </w:p>
+        </w:tc>
+      </w:tr>
+      <w:tr>
+        <w:trPr>
+          <w:cantSplit/>
+        </w:trPr>
+        <w:tc>
+          <w:tcPr>
+            <w:tcW w:w="3400" w:type="dxa"/>
+          </w:tcPr>
+          <w:p>
+            <w:pPr>
+              <w:spacing w:before="0" w:after="60"/>
+            </w:pPr>
+            <w:r>
+              <w:rPr>
+                <w:b/>
+                <w:sz w:val="18"/>
+                <w:szCs w:val="18"/>
+              </w:rPr>
+              <w:t xml:space="preserve">Telephone</w:t>
+            </w:r>
+          </w:p>
+        </w:tc>
+        <w:tc>
+          <w:tcPr>
+            <w:tcW w:w="5600" w:type="dxa"/>
+          </w:tcPr>
+          <w:p>
+            <w:pPr>
+              <w:spacing w:before="0" w:after="60"/>
+            </w:pPr>
+            <w:r>
+              <w:rPr>
+                <w:sz w:val="18"/>
+                <w:szCs w:val="18"/>
+              </w:rPr>
               <w:t xml:space="preserve">+91 120 400 0000</w:t>
             </w:r>
           </w:p>
@@ -14389,6 +15814,63 @@
                 <w:sz w:val="18"/>
                 <w:szCs w:val="18"/>
               </w:rPr>
+              <w:t xml:space="preserve">E-mail</w:t>
+            </w:r>
+          </w:p>
+        </w:tc>
+        <w:tc>
+          <w:tcPr>
+            <w:tcW w:w="5600" w:type="dxa"/>
+          </w:tcPr>
+          <w:p>
+            <w:pPr>
+              <w:spacing w:before="0" w:after="60"/>
+            </w:pPr>
+            <w:r>
+              <w:rPr>
+                <w:sz w:val="18"/>
+                <w:szCs w:val="18"/>
+              </w:rPr>
+              <w:t xml:space="preserve">bids@arkaja-renewables.example</w:t>
+            </w:r>
+          </w:p>
+        </w:tc>
+        <w:tc>
+          <w:tcPr>
+            <w:tcW w:w="900" w:type="dxa"/>
+          </w:tcPr>
+          <w:p>
+            <w:pPr>
+              <w:spacing w:before="0" w:after="60"/>
+            </w:pPr>
+            <w:r>
+              <w:rPr>
+                <w:sz w:val="18"/>
+                <w:szCs w:val="18"/>
+              </w:rPr>
+              <w:t xml:space="preserve">101</w:t>
+            </w:r>
+          </w:p>
+        </w:tc>
+      </w:tr>
+      <w:tr>
+        <w:trPr>
+          <w:cantSplit/>
+        </w:trPr>
+        <w:tc>
+          <w:tcPr>
+            <w:tcW w:w="3400" w:type="dxa"/>
+          </w:tcPr>
+          <w:p>
+            <w:pPr>
+              <w:spacing w:before="0" w:after="60"/>
+            </w:pPr>
+            <w:r>
+              <w:rPr>
+                <w:b/>
+                <w:sz w:val="18"/>
+                <w:szCs w:val="18"/>
+              </w:rPr>
               <w:t xml:space="preserve">SECI address</w:t>
             </w:r>
           </w:p>
@@ -14407,6 +15889,120 @@
                 <w:szCs w:val="18"/>
               </w:rPr>
               <w:t xml:space="preserve">Solar Energy Corporation of India Limited, 6th Floor, Plate-B, NBCC Office Block Tower-2, East Kidwai Nagar, New Delhi 110023</w:t>
+            </w:r>
+          </w:p>
+        </w:tc>
+        <w:tc>
+          <w:tcPr>
+            <w:tcW w:w="900" w:type="dxa"/>
+          </w:tcPr>
+          <w:p>
+            <w:pPr>
+              <w:spacing w:before="0" w:after="60"/>
+            </w:pPr>
+            <w:r>
+              <w:rPr>
+                <w:sz w:val="18"/>
+                <w:szCs w:val="18"/>
+              </w:rPr>
+              <w:t xml:space="preserve">101</w:t>
+            </w:r>
+          </w:p>
+        </w:tc>
+      </w:tr>
+      <w:tr>
+        <w:trPr>
+          <w:cantSplit/>
+        </w:trPr>
+        <w:tc>
+          <w:tcPr>
+            <w:tcW w:w="3400" w:type="dxa"/>
+          </w:tcPr>
+          <w:p>
+            <w:pPr>
+              <w:spacing w:before="0" w:after="60"/>
+            </w:pPr>
+            <w:r>
+              <w:rPr>
+                <w:b/>
+                <w:sz w:val="18"/>
+                <w:szCs w:val="18"/>
+              </w:rPr>
+              <w:t xml:space="preserve">RfS number (subject)</w:t>
+            </w:r>
+          </w:p>
+        </w:tc>
+        <w:tc>
+          <w:tcPr>
+            <w:tcW w:w="5600" w:type="dxa"/>
+          </w:tcPr>
+          <w:p>
+            <w:pPr>
+              <w:spacing w:before="0" w:after="60"/>
+            </w:pPr>
+            <w:r>
+              <w:rPr>
+                <w:sz w:val="18"/>
+                <w:szCs w:val="18"/>
+              </w:rPr>
+              <w:t xml:space="preserve">SECI/C&amp;P/IPP/13/0020/25-26</w:t>
+            </w:r>
+          </w:p>
+        </w:tc>
+        <w:tc>
+          <w:tcPr>
+            <w:tcW w:w="900" w:type="dxa"/>
+          </w:tcPr>
+          <w:p>
+            <w:pPr>
+              <w:spacing w:before="0" w:after="60"/>
+            </w:pPr>
+            <w:r>
+              <w:rPr>
+                <w:sz w:val="18"/>
+                <w:szCs w:val="18"/>
+              </w:rPr>
+              <w:t xml:space="preserve">101</w:t>
+            </w:r>
+          </w:p>
+        </w:tc>
+      </w:tr>
+      <w:tr>
+        <w:trPr>
+          <w:cantSplit/>
+        </w:trPr>
+        <w:tc>
+          <w:tcPr>
+            <w:tcW w:w="3400" w:type="dxa"/>
+          </w:tcPr>
+          <w:p>
+            <w:pPr>
+              <w:spacing w:before="0" w:after="60"/>
+            </w:pPr>
+            <w:r>
+              <w:rPr>
+                <w:b/>
+                <w:sz w:val="18"/>
+                <w:szCs w:val="18"/>
+              </w:rPr>
+              <w:t xml:space="preserve">RfS date</w:t>
+            </w:r>
+          </w:p>
+        </w:tc>
+        <w:tc>
+          <w:tcPr>
+            <w:tcW w:w="5600" w:type="dxa"/>
+          </w:tcPr>
+          <w:p>
+            <w:pPr>
+              <w:spacing w:before="0" w:after="60"/>
+            </w:pPr>
+            <w:r>
+              <w:rPr>
+                <w:sz w:val="18"/>
+                <w:szCs w:val="18"/>
+              </w:rPr>
+              <w:t xml:space="preserve">10.03.2026</w:t>
             </w:r>
           </w:p>
         </w:tc>
@@ -15259,7 +16855,7 @@
                 <w:sz w:val="18"/>
                 <w:szCs w:val="18"/>
               </w:rPr>
-              <w:t xml:space="preserve">Reference number and date</w:t>
+              <w:t xml:space="preserve">Reference number</w:t>
             </w:r>
           </w:p>
         </w:tc>
@@ -15276,6 +16872,63 @@
                 <w:sz w:val="18"/>
                 <w:szCs w:val="18"/>
               </w:rPr>
+              <w:t xml:space="preserve">ARK/SECI/RTC-TM-V/2026/004</w:t>
+            </w:r>
+          </w:p>
+        </w:tc>
+        <w:tc>
+          <w:tcPr>
+            <w:tcW w:w="900" w:type="dxa"/>
+          </w:tcPr>
+          <w:p>
+            <w:pPr>
+              <w:spacing w:before="0" w:after="60"/>
+            </w:pPr>
+            <w:r>
+              <w:rPr>
+                <w:sz w:val="18"/>
+                <w:szCs w:val="18"/>
+              </w:rPr>
+              <w:t xml:space="preserve">105</w:t>
+            </w:r>
+          </w:p>
+        </w:tc>
+      </w:tr>
+      <w:tr>
+        <w:trPr>
+          <w:cantSplit/>
+        </w:trPr>
+        <w:tc>
+          <w:tcPr>
+            <w:tcW w:w="3400" w:type="dxa"/>
+          </w:tcPr>
+          <w:p>
+            <w:pPr>
+              <w:spacing w:before="0" w:after="60"/>
+            </w:pPr>
+            <w:r>
+              <w:rPr>
+                <w:b/>
+                <w:sz w:val="18"/>
+                <w:szCs w:val="18"/>
+              </w:rPr>
+              <w:t xml:space="preserve">Letter date</w:t>
+            </w:r>
+          </w:p>
+        </w:tc>
+        <w:tc>
+          <w:tcPr>
+            <w:tcW w:w="5600" w:type="dxa"/>
+          </w:tcPr>
+          <w:p>
+            <w:pPr>
+              <w:spacing w:before="0" w:after="60"/>
+            </w:pPr>
+            <w:r>
+              <w:rPr>
+                <w:sz w:val="18"/>
+                <w:szCs w:val="18"/>
+              </w:rPr>
               <w:t xml:space="preserve">20.05.2026</w:t>
             </w:r>
           </w:p>
@@ -15316,7 +16969,7 @@
                 <w:sz w:val="18"/>
                 <w:szCs w:val="18"/>
               </w:rPr>
-              <w:t xml:space="preserve">Bidding Company / member name and address</w:t>
+              <w:t xml:space="preserve">Bidding Company / Member name</w:t>
             </w:r>
           </w:p>
         </w:tc>
@@ -15373,7 +17026,7 @@
                 <w:sz w:val="18"/>
                 <w:szCs w:val="18"/>
               </w:rPr>
-              <w:t xml:space="preserve">Telephone and e-mail</w:t>
+              <w:t xml:space="preserve">Bidder address</w:t>
             </w:r>
           </w:p>
         </w:tc>
@@ -15390,6 +17043,63 @@
                 <w:sz w:val="18"/>
                 <w:szCs w:val="18"/>
               </w:rPr>
+              <w:t xml:space="preserve">Unit 804, Tower B, Sector 62, Noida, Uttar Pradesh 201301</w:t>
+            </w:r>
+          </w:p>
+        </w:tc>
+        <w:tc>
+          <w:tcPr>
+            <w:tcW w:w="900" w:type="dxa"/>
+          </w:tcPr>
+          <w:p>
+            <w:pPr>
+              <w:spacing w:before="0" w:after="60"/>
+            </w:pPr>
+            <w:r>
+              <w:rPr>
+                <w:sz w:val="18"/>
+                <w:szCs w:val="18"/>
+              </w:rPr>
+              <w:t xml:space="preserve">105</w:t>
+            </w:r>
+          </w:p>
+        </w:tc>
+      </w:tr>
+      <w:tr>
+        <w:trPr>
+          <w:cantSplit/>
+        </w:trPr>
+        <w:tc>
+          <w:tcPr>
+            <w:tcW w:w="3400" w:type="dxa"/>
+          </w:tcPr>
+          <w:p>
+            <w:pPr>
+              <w:spacing w:before="0" w:after="60"/>
+            </w:pPr>
+            <w:r>
+              <w:rPr>
+                <w:b/>
+                <w:sz w:val="18"/>
+                <w:szCs w:val="18"/>
+              </w:rPr>
+              <w:t xml:space="preserve">Telephone</w:t>
+            </w:r>
+          </w:p>
+        </w:tc>
+        <w:tc>
+          <w:tcPr>
+            <w:tcW w:w="5600" w:type="dxa"/>
+          </w:tcPr>
+          <w:p>
+            <w:pPr>
+              <w:spacing w:before="0" w:after="60"/>
+            </w:pPr>
+            <w:r>
+              <w:rPr>
+                <w:sz w:val="18"/>
+                <w:szCs w:val="18"/>
+              </w:rPr>
               <w:t xml:space="preserve">+91 120 400 0000</w:t>
             </w:r>
           </w:p>
@@ -15430,6 +17140,63 @@
                 <w:sz w:val="18"/>
                 <w:szCs w:val="18"/>
               </w:rPr>
+              <w:t xml:space="preserve">E-mail</w:t>
+            </w:r>
+          </w:p>
+        </w:tc>
+        <w:tc>
+          <w:tcPr>
+            <w:tcW w:w="5600" w:type="dxa"/>
+          </w:tcPr>
+          <w:p>
+            <w:pPr>
+              <w:spacing w:before="0" w:after="60"/>
+            </w:pPr>
+            <w:r>
+              <w:rPr>
+                <w:sz w:val="18"/>
+                <w:szCs w:val="18"/>
+              </w:rPr>
+              <w:t xml:space="preserve">bids@arkaja-renewables.example</w:t>
+            </w:r>
+          </w:p>
+        </w:tc>
+        <w:tc>
+          <w:tcPr>
+            <w:tcW w:w="900" w:type="dxa"/>
+          </w:tcPr>
+          <w:p>
+            <w:pPr>
+              <w:spacing w:before="0" w:after="60"/>
+            </w:pPr>
+            <w:r>
+              <w:rPr>
+                <w:sz w:val="18"/>
+                <w:szCs w:val="18"/>
+              </w:rPr>
+              <w:t xml:space="preserve">105</w:t>
+            </w:r>
+          </w:p>
+        </w:tc>
+      </w:tr>
+      <w:tr>
+        <w:trPr>
+          <w:cantSplit/>
+        </w:trPr>
+        <w:tc>
+          <w:tcPr>
+            <w:tcW w:w="3400" w:type="dxa"/>
+          </w:tcPr>
+          <w:p>
+            <w:pPr>
+              <w:spacing w:before="0" w:after="60"/>
+            </w:pPr>
+            <w:r>
+              <w:rPr>
+                <w:b/>
+                <w:sz w:val="18"/>
+                <w:szCs w:val="18"/>
+              </w:rPr>
               <w:t xml:space="preserve">RfS number, date and tender name</w:t>
             </w:r>
           </w:p>
@@ -15448,6 +17215,120 @@
                 <w:szCs w:val="18"/>
               </w:rPr>
               <w:t xml:space="preserve">SECI/C&amp;P/IPP/13/0020/25-26</w:t>
+            </w:r>
+          </w:p>
+        </w:tc>
+        <w:tc>
+          <w:tcPr>
+            <w:tcW w:w="900" w:type="dxa"/>
+          </w:tcPr>
+          <w:p>
+            <w:pPr>
+              <w:spacing w:before="0" w:after="60"/>
+            </w:pPr>
+            <w:r>
+              <w:rPr>
+                <w:sz w:val="18"/>
+                <w:szCs w:val="18"/>
+              </w:rPr>
+              <w:t xml:space="preserve">105</w:t>
+            </w:r>
+          </w:p>
+        </w:tc>
+      </w:tr>
+      <w:tr>
+        <w:trPr>
+          <w:cantSplit/>
+        </w:trPr>
+        <w:tc>
+          <w:tcPr>
+            <w:tcW w:w="3400" w:type="dxa"/>
+          </w:tcPr>
+          <w:p>
+            <w:pPr>
+              <w:spacing w:before="0" w:after="60"/>
+            </w:pPr>
+            <w:r>
+              <w:rPr>
+                <w:b/>
+                <w:sz w:val="18"/>
+                <w:szCs w:val="18"/>
+              </w:rPr>
+              <w:t xml:space="preserve">RfS date</w:t>
+            </w:r>
+          </w:p>
+        </w:tc>
+        <w:tc>
+          <w:tcPr>
+            <w:tcW w:w="5600" w:type="dxa"/>
+          </w:tcPr>
+          <w:p>
+            <w:pPr>
+              <w:spacing w:before="0" w:after="60"/>
+            </w:pPr>
+            <w:r>
+              <w:rPr>
+                <w:sz w:val="18"/>
+                <w:szCs w:val="18"/>
+              </w:rPr>
+              <w:t xml:space="preserve">10.03.2026</w:t>
+            </w:r>
+          </w:p>
+        </w:tc>
+        <w:tc>
+          <w:tcPr>
+            <w:tcW w:w="900" w:type="dxa"/>
+          </w:tcPr>
+          <w:p>
+            <w:pPr>
+              <w:spacing w:before="0" w:after="60"/>
+            </w:pPr>
+            <w:r>
+              <w:rPr>
+                <w:sz w:val="18"/>
+                <w:szCs w:val="18"/>
+              </w:rPr>
+              <w:t xml:space="preserve">105</w:t>
+            </w:r>
+          </w:p>
+        </w:tc>
+      </w:tr>
+      <w:tr>
+        <w:trPr>
+          <w:cantSplit/>
+        </w:trPr>
+        <w:tc>
+          <w:tcPr>
+            <w:tcW w:w="3400" w:type="dxa"/>
+          </w:tcPr>
+          <w:p>
+            <w:pPr>
+              <w:spacing w:before="0" w:after="60"/>
+            </w:pPr>
+            <w:r>
+              <w:rPr>
+                <w:b/>
+                <w:sz w:val="18"/>
+                <w:szCs w:val="18"/>
+              </w:rPr>
+              <w:t xml:space="preserve">RfS title</w:t>
+            </w:r>
+          </w:p>
+        </w:tc>
+        <w:tc>
+          <w:tcPr>
+            <w:tcW w:w="5600" w:type="dxa"/>
+          </w:tcPr>
+          <w:p>
+            <w:pPr>
+              <w:spacing w:before="0" w:after="60"/>
+            </w:pPr>
+            <w:r>
+              <w:rPr>
+                <w:sz w:val="18"/>
+                <w:szCs w:val="18"/>
+              </w:rPr>
+              <w:t xml:space="preserve">Supply of 1000 MW Round-the-Clock Thermal Mimic (RTC-TM) power from ISTS-connected RE projects</w:t>
             </w:r>
           </w:p>
         </w:tc>

</xml_diff>

<commit_message>
Demo rerun: 150 steps, 0 failed, with losses, the 25-year dispatch and the team
Co-Authored-By: Claude Opus 5.5 <noreply@anthropic.com>
Claude-Session: https://claude.ai/code/session_016jKkuHBjiyJimAVAdehBdi
</commit_message>
<xml_diff>
--- a/demo/arkaja-seci-rtc-tm-v/bid-pack/SECI_RTC_TM_V_bid_200MW.docx
+++ b/demo/arkaja-seci-rtc-tm-v/bid-pack/SECI_RTC_TM_V_bid_200MW.docx
@@ -208,7 +208,7 @@
                 <w:sz w:val="18"/>
                 <w:szCs w:val="18"/>
               </w:rPr>
-              <w:t xml:space="preserve">₹6.87/kWh, fixed for the term</w:t>
+              <w:t xml:space="preserve">₹7.05/kWh, fixed for the term</w:t>
             </w:r>
           </w:p>
         </w:tc>
@@ -248,7 +248,7 @@
                 <w:sz w:val="18"/>
                 <w:szCs w:val="18"/>
               </w:rPr>
-              <w:t xml:space="preserve">₹6.863/kWh</w:t>
+              <w:t xml:space="preserve">₹7.043/kWh</w:t>
             </w:r>
           </w:p>
         </w:tc>
@@ -288,7 +288,7 @@
                 <w:sz w:val="18"/>
                 <w:szCs w:val="18"/>
               </w:rPr>
-              <w:t xml:space="preserve">511 MW</w:t>
+              <w:t xml:space="preserve">523 MW</w:t>
             </w:r>
           </w:p>
         </w:tc>
@@ -328,7 +328,7 @@
                 <w:sz w:val="18"/>
                 <w:szCs w:val="18"/>
               </w:rPr>
-              <w:t xml:space="preserve">281 MW</w:t>
+              <w:t xml:space="preserve">293 MW</w:t>
             </w:r>
           </w:p>
         </w:tc>
@@ -368,7 +368,7 @@
                 <w:sz w:val="18"/>
                 <w:szCs w:val="18"/>
               </w:rPr>
-              <w:t xml:space="preserve">422 MW / 1,686 MWh</w:t>
+              <w:t xml:space="preserve">423 MW / 1,692 MWh</w:t>
             </w:r>
           </w:p>
         </w:tc>
@@ -408,7 +408,7 @@
                 <w:sz w:val="18"/>
                 <w:szCs w:val="18"/>
               </w:rPr>
-              <w:t xml:space="preserve">₹128.34 crore</w:t>
+              <w:t xml:space="preserve">₹131.31 crore</w:t>
             </w:r>
           </w:p>
         </w:tc>
@@ -448,7 +448,7 @@
                 <w:sz w:val="18"/>
                 <w:szCs w:val="18"/>
               </w:rPr>
-              <w:t xml:space="preserve">₹320.84 crore</w:t>
+              <w:t xml:space="preserve">₹328.28 crore</w:t>
             </w:r>
           </w:p>
         </w:tc>
@@ -488,7 +488,7 @@
                 <w:sz w:val="18"/>
                 <w:szCs w:val="18"/>
               </w:rPr>
-              <w:t xml:space="preserve">₹1,283.35 crore</w:t>
+              <w:t xml:space="preserve">₹1,313.11 crore</w:t>
             </w:r>
           </w:p>
         </w:tc>
@@ -1488,7 +1488,7 @@
                 <w:sz w:val="18"/>
                 <w:szCs w:val="18"/>
               </w:rPr>
-              <w:t xml:space="preserve">6.87</w:t>
+              <w:t xml:space="preserve">7.05</w:t>
             </w:r>
           </w:p>
         </w:tc>
@@ -2306,7 +2306,7 @@
                 <w:sz w:val="18"/>
                 <w:szCs w:val="18"/>
               </w:rPr>
-              <w:t xml:space="preserve">At ₹6.87/kWh the equity IRR is 14.0% (target 14.0%), project IRR 10.0%.</w:t>
+              <w:t xml:space="preserve">At ₹7.05/kWh the equity IRR is 14.0% (target 14.0%), project IRR 10.0%.</w:t>
             </w:r>
           </w:p>
         </w:tc>
@@ -2380,7 +2380,7 @@
                 <w:sz w:val="18"/>
                 <w:szCs w:val="18"/>
               </w:rPr>
-              <w:t xml:space="preserve">422 MW / 1686 MWh</w:t>
+              <w:t xml:space="preserve">423 MW / 1692 MWh</w:t>
             </w:r>
           </w:p>
         </w:tc>
@@ -2602,7 +2602,7 @@
                 <w:sz w:val="18"/>
                 <w:szCs w:val="18"/>
               </w:rPr>
-              <w:t xml:space="preserve">Need ₹1283.35 cr; you have ₹6500.00 cr</w:t>
+              <w:t xml:space="preserve">Need ₹1313.11 cr; you have ₹6500.00 cr</w:t>
             </w:r>
           </w:p>
         </w:tc>
@@ -2750,7 +2750,7 @@
                 <w:sz w:val="18"/>
                 <w:szCs w:val="18"/>
               </w:rPr>
-              <w:t xml:space="preserve">₹128.34 crore</w:t>
+              <w:t xml:space="preserve">₹131.31 crore</w:t>
             </w:r>
           </w:p>
         </w:tc>
@@ -2824,7 +2824,7 @@
                 <w:sz w:val="18"/>
                 <w:szCs w:val="18"/>
               </w:rPr>
-              <w:t xml:space="preserve">₹320.84 crore</w:t>
+              <w:t xml:space="preserve">₹328.28 crore</w:t>
             </w:r>
           </w:p>
         </w:tc>
@@ -4515,7 +4515,7 @@
                 <w:sz w:val="18"/>
                 <w:szCs w:val="18"/>
               </w:rPr>
-              <w:t xml:space="preserve">Solar PV component (MW)</w:t>
+              <w:t xml:space="preserve">Solar PV component (MWac, with its MWp)</w:t>
             </w:r>
           </w:p>
         </w:tc>
@@ -4532,7 +4532,7 @@
                 <w:sz w:val="18"/>
                 <w:szCs w:val="18"/>
               </w:rPr>
-              <w:t xml:space="preserve">511</w:t>
+              <w:t xml:space="preserve">523 MWac (732 MWp DC)</w:t>
             </w:r>
           </w:p>
         </w:tc>
@@ -4589,7 +4589,7 @@
                 <w:sz w:val="18"/>
                 <w:szCs w:val="18"/>
               </w:rPr>
-              <w:t xml:space="preserve">281</w:t>
+              <w:t xml:space="preserve">293</w:t>
             </w:r>
           </w:p>
         </w:tc>
@@ -4703,7 +4703,7 @@
                 <w:sz w:val="18"/>
                 <w:szCs w:val="18"/>
               </w:rPr>
-              <w:t xml:space="preserve">422</w:t>
+              <w:t xml:space="preserve">423</w:t>
             </w:r>
           </w:p>
         </w:tc>
@@ -4760,7 +4760,7 @@
                 <w:sz w:val="18"/>
                 <w:szCs w:val="18"/>
               </w:rPr>
-              <w:t xml:space="preserve">1686</w:t>
+              <w:t xml:space="preserve">1692</w:t>
             </w:r>
           </w:p>
         </w:tc>
@@ -4988,7 +4988,7 @@
                 <w:sz w:val="18"/>
                 <w:szCs w:val="18"/>
               </w:rPr>
-              <w:t xml:space="preserve">INR 1,28,33,50,009</w:t>
+              <w:t xml:space="preserve">INR 1,31,31,14,577</w:t>
             </w:r>
           </w:p>
         </w:tc>
@@ -7078,7 +7078,7 @@
                 <w:sz w:val="18"/>
                 <w:szCs w:val="18"/>
               </w:rPr>
-              <w:t xml:space="preserve">INR 1,28,33,50,009</w:t>
+              <w:t xml:space="preserve">INR 1,31,31,14,577</w:t>
             </w:r>
           </w:p>
         </w:tc>
@@ -8525,7 +8525,7 @@
                 <w:sz w:val="18"/>
                 <w:szCs w:val="18"/>
               </w:rPr>
-              <w:t xml:space="preserve">INR 3,20,83,75,021</w:t>
+              <w:t xml:space="preserve">INR 3,28,27,86,443</w:t>
             </w:r>
           </w:p>
         </w:tc>
@@ -9516,7 +9516,7 @@
                 <w:sz w:val="18"/>
                 <w:szCs w:val="18"/>
               </w:rPr>
-              <w:t xml:space="preserve">INR 3,20,83,75,021</w:t>
+              <w:t xml:space="preserve">INR 3,28,27,86,443</w:t>
             </w:r>
           </w:p>
         </w:tc>
@@ -11134,7 +11134,7 @@
                 <w:sz w:val="18"/>
                 <w:szCs w:val="18"/>
               </w:rPr>
-              <w:t xml:space="preserve">INR 3,20,83,75,021</w:t>
+              <w:t xml:space="preserve">INR 3,28,27,86,443</w:t>
             </w:r>
           </w:p>
         </w:tc>
@@ -19021,7 +19021,7 @@
                 <w:sz w:val="18"/>
                 <w:szCs w:val="18"/>
               </w:rPr>
-              <w:t xml:space="preserve">6.87</w:t>
+              <w:t xml:space="preserve">7.05</w:t>
             </w:r>
           </w:p>
         </w:tc>
@@ -19078,7 +19078,7 @@
                 <w:sz w:val="18"/>
                 <w:szCs w:val="18"/>
               </w:rPr>
-              <w:t xml:space="preserve">Rupees Six and Paise Eighty-Seven only per kWh</w:t>
+              <w:t xml:space="preserve">Rupees Seven and Paise Five only per kWh</w:t>
             </w:r>
           </w:p>
         </w:tc>
@@ -19727,31 +19727,31 @@
                 <w:sz w:val="18"/>
                 <w:szCs w:val="18"/>
               </w:rPr>
-              <w:t xml:space="preserve">Solar PV 511 MWac with modules, inverters, trackers and pooling: per the Capex sheet of the financial model.</w:t>
-            </w:r>
-          </w:p>
-          <w:p>
-            <w:pPr>
-              <w:spacing w:before="0" w:after="60"/>
-            </w:pPr>
-            <w:r>
-              <w:rPr>
-                <w:sz w:val="18"/>
-                <w:szCs w:val="18"/>
-              </w:rPr>
-              <w:t xml:space="preserve">Wind 281 MW with WTGs, foundations and 33 kV collection: per the Capex sheet.</w:t>
-            </w:r>
-          </w:p>
-          <w:p>
-            <w:pPr>
-              <w:spacing w:before="0" w:after="60"/>
-            </w:pPr>
-            <w:r>
-              <w:rPr>
-                <w:sz w:val="18"/>
-                <w:szCs w:val="18"/>
-              </w:rPr>
-              <w:t xml:space="preserve">Battery energy storage 422 MW / 1686 MWh with PCS and fire protection: per the Capex sheet.</w:t>
+              <w:t xml:space="preserve">Solar PV 523 MWac with modules, inverters, trackers and pooling: per the Capex sheet of the financial model.</w:t>
+            </w:r>
+          </w:p>
+          <w:p>
+            <w:pPr>
+              <w:spacing w:before="0" w:after="60"/>
+            </w:pPr>
+            <w:r>
+              <w:rPr>
+                <w:sz w:val="18"/>
+                <w:szCs w:val="18"/>
+              </w:rPr>
+              <w:t xml:space="preserve">Wind 293 MW with WTGs, foundations and 33 kV collection: per the Capex sheet.</w:t>
+            </w:r>
+          </w:p>
+          <w:p>
+            <w:pPr>
+              <w:spacing w:before="0" w:after="60"/>
+            </w:pPr>
+            <w:r>
+              <w:rPr>
+                <w:sz w:val="18"/>
+                <w:szCs w:val="18"/>
+              </w:rPr>
+              <w:t xml:space="preserve">Battery energy storage 423 MW / 1692 MWh with PCS and fire protection: per the Capex sheet.</w:t>
             </w:r>
           </w:p>
           <w:p>

</xml_diff>